<commit_message>
refactor: rename project and update shared types references
</commit_message>
<xml_diff>
--- a/docs/01_system_design.docx
+++ b/docs/01_system_design.docx
@@ -29,7 +29,7 @@
           <w:sz w:val="56"/>
           <w:szCs w:val="56"/>
         </w:rPr>
-        <w:t xml:space="preserve">The Joy of System Design</w:t>
+        <w:t xml:space="preserve">Stackdify</w:t>
       </w:r>
     </w:p>
     <w:p>
@@ -100,7 +100,7 @@
           <w:sz w:val="22"/>
           <w:szCs w:val="22"/>
         </w:rPr>
-        <w:t xml:space="preserve">The Joy of System Design is a gamified web platform for software engineers to practice and master system design concepts. Inspired by LeetCode's problem-solving loop, the platform presents interactive architecture puzzles where users drag-and-drop system components into incomplete architecture graphs to complete real-world system designs (YouTube, Instagram, TikTok, etc.).</w:t>
+        <w:t xml:space="preserve">Stackdify is a gamified web platform for software engineers to practice and master system design concepts. Inspired by LeetCode's problem-solving loop, the platform presents interactive architecture puzzles where users drag-and-drop system components into incomplete architecture graphs to complete real-world system designs (YouTube, Instagram, TikTok, etc.).</w:t>
       </w:r>
     </w:p>
     <w:p>
@@ -257,7 +257,7 @@
                 <w:sz w:val="20"/>
                 <w:szCs w:val="20"/>
               </w:rPr>
-              <w:t xml:space="preserve">The Joy of System Design</w:t>
+              <w:t xml:space="preserve">Stackdify</w:t>
             </w:r>
           </w:p>
         </w:tc>
@@ -1446,7 +1446,7 @@
           <w:sz w:val="18"/>
           <w:szCs w:val="18"/>
         </w:rPr>
-        <w:t xml:space="preserve">joy-of-system-design/</w:t>
+        <w:t xml:space="preserve">stackdify/</w:t>
       </w:r>
     </w:p>
     <w:p>
@@ -6929,7 +6929,7 @@
         <w:sz w:val="20"/>
         <w:szCs w:val="20"/>
       </w:rPr>
-      <w:t xml:space="preserve">The Joy of System Design — </w:t>
+      <w:t xml:space="preserve">Stackdify — </w:t>
     </w:r>
     <w:r>
       <w:rPr>

</xml_diff>